<commit_message>
Apply positive-expression rule to mid-term abstract
Reword docx body to positive framing (avoid 小さい/低い/低下/低減/下げる):
高純度な基準信号源 / 高純度であるほど / 高純度化できるか / 約3 dB 改善 / 1/N となる純度向上.
Record the rule in 要旨ドラフト.md banner for the whole 中間発表.

Co-Authored-By: Claude Opus 4.8 (1M context) <noreply@anthropic.com>
</commit_message>
<xml_diff>
--- a/worklog/2026_semester_S/中間発表/発表要旨/福井晴士郎_修論要旨.docx
+++ b/worklog/2026_semester_S/中間発表/発表要旨/福井晴士郎_修論要旨.docx
@@ -73,7 +73,7 @@
           <w:sz w:val="21"/>
           <w:szCs w:val="21"/>
         </w:rPr>
-        <w:t xml:space="preserve">精密な周波数基準信号源は、通信・測位・計測といった現代技術の基盤である。その理想は位相雑音のない正弦波であり、位相雑音が低いほどコヒーレント光通信のチャネル容量、GNSS測位精度、スペクトル分解能、原子時計どうしの比較精度などが向上する。本研究は、安価な水晶発振器を用いて、できる限り位相雑音の小さい基準信号源を構築することを目的とする。</w:t>
+        <w:t xml:space="preserve">精密な周波数基準信号源は、通信・測位・計測といった現代技術の基盤である。その理想は位相雑音のない正弦波であり、高純度であるほどコヒーレント光通信のチャネル容量、GNSS測位精度、スペクトル分解能、原子時計どうしの比較精度などが向上する。本研究は、安価な水晶発振器を用いて、できる限り高純度な基準信号源を構築することを目的とする。</w:t>
       </w:r>
     </w:p>
     <w:p>
@@ -103,7 +103,7 @@
           <w:sz w:val="21"/>
           <w:szCs w:val="21"/>
         </w:rPr>
-        <w:t xml:space="preserve">市販の基準信号源は広い性能帯に分布する。各種発振器（TCXO・恒温槽付水晶発振器(OCXO)・ルビジウム(PRS10)・水素メーザー(iMaser)・高安定OCXO(cybershaft 等)）の位相雑音(dBc/Hz)を同一搬送波に換算して比較すると、高性能機ほど大型・高価かつ外部基準への依存を伴う。実用面ではGPS規律発振器(GPSDO)が長期基準として確立し、近傍オフセットで概ね −100 dBc/Hz 級に達する。一方、民生用OCXOは小型・安価で短期安定度に優れるが、単体の位相安定度には物理的限界がある。特に1秒より短い時間スケール（オフセット周波数 ≳1 Hz）の近傍位相雑音をどこまで下げられるかが鍵となる。</w:t>
+        <w:t xml:space="preserve">市販の基準信号源は広い性能帯に分布する。各種発振器（TCXO・恒温槽付水晶発振器(OCXO)・ルビジウム(PRS10)・水素メーザー(iMaser)・高安定OCXO(cybershaft 等)）の位相雑音(dBc/Hz)を同一搬送波に換算して比較すると、高性能機ほど大型・高価かつ外部基準への依存を伴う。実用面ではGPS規律発振器(GPSDO)が長期基準として確立し、近傍オフセットで概ね −100 dBc/Hz 級に達する。一方、民生用OCXOは小型・安価で短期安定度に優れるが、単体の位相安定度には物理的限界がある。特に1秒より短い時間スケール（オフセット周波数 ≳1 Hz）の近傍の位相純度をどこまで高められるかが鍵となる。</w:t>
       </w:r>
     </w:p>
     <w:p>
@@ -133,7 +133,7 @@
           <w:sz w:val="21"/>
           <w:szCs w:val="21"/>
         </w:rPr>
-        <w:t xml:space="preserve">単体の限界を超えるため、複数のOCXOを同期させて平均化する。互いに無相関な雑音は N 台の平均で電力が 1/N となり、2台で位相雑音が約3 dB（dBc/Hz）低下する。これは国際原子時(TAI)が多数の原子時計を統計合成する発想を、より小規模・実時間で水晶発振器に適用するものである。平均が意味を持つには各発振器の位相が時間的に揃っている必要があり、(a)雑音を注入せずに同期する制御と、(b)1秒未満の近傍位相雑音を測る高分解能測定の二つが前提となる。</w:t>
+        <w:t xml:space="preserve">単体の限界を超えるため、複数のOCXOを同期させて平均化する。互いに無相関な雑音は N 台の平均で電力が 1/N となり、2台で位相雑音を約3 dB（dBc/Hz）改善できる。これは国際原子時(TAI)が多数の原子時計を統計合成する発想を、より小規模・実時間で水晶発振器に適用するものである。平均が意味を持つには各発振器の位相が時間的に揃っている必要があり、(a)雑音を注入せずに同期する制御と、(b)1秒未満の近傍位相雑音を測る高分解能測定の二つが前提となる。</w:t>
       </w:r>
     </w:p>
     <w:p>
@@ -223,7 +223,7 @@
           <w:sz w:val="21"/>
           <w:szCs w:val="21"/>
         </w:rPr>
-        <w:t xml:space="preserve">同期した2台を平均（ミキサ等）して単体比 −3 dB の低減を実証し、N台へ拡張する。さらに、理論上 1/N 低減が成立する双方向（相互）結合へ制御を発展させ、アラン分散による長期安定度評価とあわせて、複数水晶発振器の同期・平均化が市販ベンチマーク（GPSDO等, −100 dBc/Hz級）に近づきうることを示す。</w:t>
+        <w:t xml:space="preserve">同期した2台を平均（ミキサ等）して単体比 3 dB の改善（高純度化）を実証し、N台へ拡張する。さらに、理論上 位相雑音が1/Nとなる（純度が向上する）双方向（相互）結合へ制御を発展させ、アラン分散による長期安定度評価とあわせて、複数水晶発振器の同期・平均化が市販ベンチマーク（GPSDO等, −100 dBc/Hz級）に近づきうることを示す。</w:t>
       </w:r>
     </w:p>
     <w:sectPr>

</xml_diff>

<commit_message>
Rewrite abstract body in academic prose style
Per user feedback, reword the docx body into flowing 論文調 prose:
remove bracket labels (測定法/同期/結果), compress enumerations, drop
rhetorical phrasing and repeated time-scale mentions. Numbered headers kept;
content, figures-of-merit and positive-expression rule unchanged.

Co-Authored-By: Claude Opus 4.8 (1M context) <noreply@anthropic.com>
</commit_message>
<xml_diff>
--- a/worklog/2026_semester_S/中間発表/発表要旨/福井晴士郎_修論要旨.docx
+++ b/worklog/2026_semester_S/中間発表/発表要旨/福井晴士郎_修論要旨.docx
@@ -73,7 +73,7 @@
           <w:sz w:val="21"/>
           <w:szCs w:val="21"/>
         </w:rPr>
-        <w:t xml:space="preserve">精密な周波数基準信号源は、通信・測位・計測といった現代技術の基盤である。その理想は位相雑音のない正弦波であり、高純度であるほどコヒーレント光通信のチャネル容量、GNSS測位精度、スペクトル分解能、原子時計どうしの比較精度などが向上する。本研究は、安価な水晶発振器を用いて、できる限り高純度な基準信号源を構築することを目的とする。</w:t>
+        <w:t xml:space="preserve">高純度な周波数基準信号源は、コヒーレント光通信や衛星測位、精密計測の性能を支える要素である。その理想は位相雑音のない正弦波であり、純度の向上はこれらの応用における性能向上に直結する。本研究では、安価な水晶発振器を用いて可能な限り高純度な基準信号源を構築することを目的とする。</w:t>
       </w:r>
     </w:p>
     <w:p>
@@ -103,7 +103,7 @@
           <w:sz w:val="21"/>
           <w:szCs w:val="21"/>
         </w:rPr>
-        <w:t xml:space="preserve">市販の基準信号源は広い性能帯に分布する。各種発振器（TCXO・恒温槽付水晶発振器(OCXO)・ルビジウム(PRS10)・水素メーザー(iMaser)・高安定OCXO(cybershaft 等)）の位相雑音(dBc/Hz)を同一搬送波に換算して比較すると、高性能機ほど大型・高価かつ外部基準への依存を伴う。実用面ではGPS規律発振器(GPSDO)が長期基準として確立し、近傍オフセットで概ね −100 dBc/Hz 級に達する。一方、民生用OCXOは小型・安価で短期安定度に優れるが、単体の位相安定度には物理的限界がある。特に1秒より短い時間スケール（オフセット周波数 ≳1 Hz）の近傍の位相純度をどこまで高められるかが鍵となる。</w:t>
+        <w:t xml:space="preserve">市販の基準信号源は広い性能帯に分布する。各種発振器（TCXO・OCXO・ルビジウム・水素メーザー等）の位相雑音を同一搬送波に換算して比較すると、高性能機ほど大型かつ高価であり、外部基準への依存も伴う。実用面ではGPS規律発振器(GPSDO)が長期基準として確立しており、搬送波近傍で概ね −100 dBc/Hz 級に達する。一方、民生用の恒温槽付水晶発振器(OCXO)は小型・安価で短期安定度に優れるものの、単体の位相安定度には原理的な上限が存在する。とりわけ1秒より短い時間スケール（オフセット周波数 ≳1 Hz）における位相純度の向上が課題となる。</w:t>
       </w:r>
     </w:p>
     <w:p>
@@ -118,7 +118,7 @@
           <w:sz w:val="21"/>
           <w:szCs w:val="21"/>
         </w:rPr>
-        <w:t xml:space="preserve">3. アプローチ：複数源の平均化</w:t>
+        <w:t xml:space="preserve">3. アプローチ</w:t>
       </w:r>
     </w:p>
     <w:p>
@@ -133,7 +133,7 @@
           <w:sz w:val="21"/>
           <w:szCs w:val="21"/>
         </w:rPr>
-        <w:t xml:space="preserve">単体の限界を超えるため、複数のOCXOを同期させて平均化する。互いに無相関な雑音は N 台の平均で電力が 1/N となり、2台で位相雑音を約3 dB（dBc/Hz）改善できる。これは国際原子時(TAI)が多数の原子時計を統計合成する発想を、より小規模・実時間で水晶発振器に適用するものである。平均が意味を持つには各発振器の位相が時間的に揃っている必要があり、(a)雑音を注入せずに同期する制御と、(b)1秒未満の近傍位相雑音を測る高分解能測定の二つが前提となる。</w:t>
+        <w:t xml:space="preserve">そこで本研究では、複数のOCXOを同期させて平均化し、単体の性能を超える基準信号源の構築を図る。互いに無相関な雑音は N 台の平均によって電力が 1/N となり、2台では位相雑音を約3 dB 改善できる。これは国際原子時(TAI)が多数の原子時計を統計合成する手法を、より小規模かつ実時間で水晶発振器に適用するものである。平均化が有効に機能するには各発振器の位相が時間的に揃っている必要があり、雑音を加えずに同期する制御と、1秒未満の近傍位相雑音を捉える高分解能測定の双方が前提となる。</w:t>
       </w:r>
     </w:p>
     <w:p>
@@ -148,7 +148,7 @@
           <w:sz w:val="21"/>
           <w:szCs w:val="21"/>
         </w:rPr>
-        <w:t xml:space="preserve">4. 手法と現状の結果</w:t>
+        <w:t xml:space="preserve">4. 手法と結果</w:t>
       </w:r>
     </w:p>
     <w:p>
@@ -163,7 +163,22 @@
           <w:sz w:val="21"/>
           <w:szCs w:val="21"/>
         </w:rPr>
-        <w:t xml:space="preserve">【測定法】2台の10 MHz OCXO信号をステレオ録音し、ヒルベルト変換で2台間の時間ジッタ差を抽出、位相雑音 L(f) [dBc/Hz] として評価する手法を構築した。これによりオフセット ≳0.1 Hz（=1秒未満の時間スケール）の近傍位相雑音をピコ秒級分解能で測定できる。</w:t>
+        <w:t xml:space="preserve">位相差の評価には、2台の10 MHz信号をステレオ録音し、ヒルベルト変換によって時間ジッタ差を抽出して位相雑音 L(f) をピコ秒級分解能で求める手法を構築し、オフセット ≳0.1 Hz の近傍位相雑音を測定できるようにした。同期制御は、デジタルオシロスコープで取得したエッジ間時間差(FRFR)を NI 製 DAQ を介して一方の発振器に帰還する構成とし、最小電圧ステップ応答から同定したプラントゲイン（K≈860 ns/(V·s)）に基づいて帰還則を設計した。比例・微分制御では制御電圧の過大な変動が短期位相雑音を生じるのに対し、本手法では追従ゲインを適切に選ぶことで、開ループ保持(HOLD)と同等の近傍位相雑音を保ったまま同期できることを確認した（モデルとHOLDの低周波位相雑音差 ≈ 0 dB）。</w:t>
+      </w:r>
+    </w:p>
+    <w:p>
+      <w:pPr>
+        <w:spacing w:after="40" w:before="80"/>
+      </w:pPr>
+      <w:r>
+        <w:rPr>
+          <w:rFonts w:ascii="Yu Mincho" w:cs="Yu Mincho" w:eastAsia="Yu Mincho" w:hAnsi="Yu Mincho"/>
+          <w:b/>
+          <w:bCs/>
+          <w:sz w:val="21"/>
+          <w:szCs w:val="21"/>
+        </w:rPr>
+        <w:t xml:space="preserve">5. 今後の展望</w:t>
       </w:r>
     </w:p>
     <w:p>
@@ -178,52 +193,7 @@
           <w:sz w:val="21"/>
           <w:szCs w:val="21"/>
         </w:rPr>
-        <w:t xml:space="preserve">【同期】デジタルオシロでエッジ間時間差(FRFR)を取得し、NI製DAQで一方のOCXOに制御電圧を印加する。最小電圧ステップ応答からプラントゲインを実測（K≈860 ns/(V·s)）し、この実測モデルに基づいて「必要な量だけ電圧を動かす」フィードバック則を考案した。</w:t>
-      </w:r>
-    </w:p>
-    <w:p>
-      <w:pPr>
-        <w:spacing w:after="100" w:line="300"/>
-        <w:ind w:firstLine="220"/>
-        <w:jc w:val="both"/>
-      </w:pPr>
-      <w:r>
-        <w:rPr>
-          <w:rFonts w:ascii="Yu Mincho" w:cs="Yu Mincho" w:eastAsia="Yu Mincho" w:hAnsi="Yu Mincho"/>
-          <w:sz w:val="21"/>
-          <w:szCs w:val="21"/>
-        </w:rPr>
-        <w:t xml:space="preserve">【結果】従来の比例・微分(PID)制御は、制御電圧の過剰な動きによって短期位相雑音（ハンチング）を注入してしまう。これに対し、実測モデルに基づく制御は、追従ゲインを適切に選ぶと無制御(開ループ保持, HOLD)と同等の近傍位相雑音で同期できることを実測で確認した（モデルFBとHOLDの低周波位相雑音差 ≈ 0 dB）。すなわち「雑音を注入せずに同期する」段階に到達した。</w:t>
-      </w:r>
-    </w:p>
-    <w:p>
-      <w:pPr>
-        <w:spacing w:after="40" w:before="80"/>
-      </w:pPr>
-      <w:r>
-        <w:rPr>
-          <w:rFonts w:ascii="Yu Mincho" w:cs="Yu Mincho" w:eastAsia="Yu Mincho" w:hAnsi="Yu Mincho"/>
-          <w:b/>
-          <w:bCs/>
-          <w:sz w:val="21"/>
-          <w:szCs w:val="21"/>
-        </w:rPr>
-        <w:t xml:space="preserve">5. 今後の予定</w:t>
-      </w:r>
-    </w:p>
-    <w:p>
-      <w:pPr>
-        <w:spacing w:after="100" w:line="300"/>
-        <w:ind w:firstLine="220"/>
-        <w:jc w:val="both"/>
-      </w:pPr>
-      <w:r>
-        <w:rPr>
-          <w:rFonts w:ascii="Yu Mincho" w:cs="Yu Mincho" w:eastAsia="Yu Mincho" w:hAnsi="Yu Mincho"/>
-          <w:sz w:val="21"/>
-          <w:szCs w:val="21"/>
-        </w:rPr>
-        <w:t xml:space="preserve">同期した2台を平均（ミキサ等）して単体比 3 dB の改善（高純度化）を実証し、N台へ拡張する。さらに、理論上 位相雑音が1/Nとなる（純度が向上する）双方向（相互）結合へ制御を発展させ、アラン分散による長期安定度評価とあわせて、複数水晶発振器の同期・平均化が市販ベンチマーク（GPSDO等, −100 dBc/Hz級）に近づきうることを示す。</w:t>
+        <w:t xml:space="preserve">今後は、同期した2台をミキサ等で平均し、単体比 3 dB の改善（高純度化）を実証したうえで N 台へ拡張する。さらに、理論上 位相雑音が 1/N となる相互結合へ制御を発展させ、アラン分散による長期安定度評価とあわせて、複数水晶発振器の同期・平均化により市販基準（GPSDO 等, −100 dBc/Hz 級）に迫る性能を目指す。</w:t>
       </w:r>
     </w:p>
     <w:sectPr>

</xml_diff>